<commit_message>
upd: chapter 3, 4, 5
</commit_message>
<xml_diff>
--- a/Chapter3_Methodology.docx
+++ b/Chapter3_Methodology.docx
@@ -2321,7 +2321,7 @@
           <w:sz w:val="24"/>
           <w:szCs w:val="24"/>
         </w:rPr>
-        <w:t xml:space="preserve">where TP, FP, and FN is the pixel counts defined above.</w:t>
+        <w:t xml:space="preserve">where TP, FP, and FN are the pixel counts defined above.</w:t>
       </w:r>
     </w:p>
     <w:p>
@@ -2450,7 +2450,7 @@
           <w:sz w:val="24"/>
           <w:szCs w:val="24"/>
         </w:rPr>
-        <w:t xml:space="preserve">where ∂M and ∂G is the boundary pixels of the segmentation and of the ground truth, d(p, ∂G) is the Euclidean distance from pixel p to the nearest pixel of ∂G, and </w:t>
+        <w:t xml:space="preserve">where ∂M and ∂G are the boundary pixels of the segmentation and of the ground truth, d(p, ∂G) is the Euclidean distance from pixel p to the nearest pixel of ∂G, and </w:t>
       </w:r>
       <w:r>
         <w:rPr>
@@ -3127,7 +3127,7 @@
           <w:sz w:val="24"/>
           <w:szCs w:val="24"/>
         </w:rPr>
-        <w:t xml:space="preserve"> is the number of slices and of configurations.</w:t>
+        <w:t xml:space="preserve"> are the number of slices and of configurations.</w:t>
       </w:r>
     </w:p>
     <w:p>
@@ -12555,7 +12555,7 @@
           <w:sz w:val="24"/>
           <w:szCs w:val="24"/>
         </w:rPr>
-        <w:t xml:space="preserve"> is the thresholds, with </w:t>
+        <w:t xml:space="preserve"> are the thresholds, with </w:t>
       </w:r>
       <w:r>
         <w:rPr>
@@ -12636,7 +12636,7 @@
           <w:sz w:val="24"/>
           <w:szCs w:val="24"/>
         </w:rPr>
-        <w:t xml:space="preserve"> is the pixel fraction and mean intensity of class k, and </w:t>
+        <w:t xml:space="preserve"> are the pixel fraction and mean intensity of class k, and </w:t>
       </w:r>
       <w:r>
         <w:rPr>
@@ -13398,7 +13398,7 @@
           <w:sz w:val="24"/>
           <w:szCs w:val="24"/>
         </w:rPr>
-        <w:t xml:space="preserve">′ is the rescaled contrast and inscribed radius, </w:t>
+        <w:t xml:space="preserve">′ are the rescaled contrast and inscribed radius, </w:t>
       </w:r>
       <w:r>
         <w:rPr>
@@ -13506,7 +13506,7 @@
           <w:sz w:val="24"/>
           <w:szCs w:val="24"/>
         </w:rPr>
-        <w:t xml:space="preserve"> is the weights 0.5, 1, and 0.2.</w:t>
+        <w:t xml:space="preserve"> are the weights 0.5, 1, and 0.2.</w:t>
       </w:r>
     </w:p>
     <w:p>
@@ -14295,7 +14295,7 @@
           <w:sz w:val="24"/>
           <w:szCs w:val="24"/>
         </w:rPr>
-        <w:t xml:space="preserve">) is the log-domain intensities of pixels x and y, and </w:t>
+        <w:t xml:space="preserve">) are the log-domain intensities of pixels x and y, and </w:t>
       </w:r>
       <w:r>
         <w:rPr>
@@ -15281,7 +15281,7 @@
           <w:sz w:val="24"/>
           <w:szCs w:val="24"/>
         </w:rPr>
-        <w:t xml:space="preserve">) is the region pixels inside that window, and </w:t>
+        <w:t xml:space="preserve">) is the set of region pixels inside that window, and </w:t>
       </w:r>
       <w:r>
         <w:rPr>
@@ -16253,7 +16253,7 @@
           <w:sz w:val="24"/>
           <w:szCs w:val="24"/>
         </w:rPr>
-        <w:t xml:space="preserve"> is the local and global bounds, and </w:t>
+        <w:t xml:space="preserve"> are the local and global bounds, and </w:t>
       </w:r>
       <w:r>
         <w:rPr>
@@ -16307,7 +16307,7 @@
           <w:sz w:val="24"/>
           <w:szCs w:val="24"/>
         </w:rPr>
-        <w:t xml:space="preserve"> is the local and global multipliers, 4 and 5.</w:t>
+        <w:t xml:space="preserve"> are the local and global multipliers, 4 and 5.</w:t>
       </w:r>
     </w:p>
     <w:p>
@@ -16796,7 +16796,7 @@
           <w:sz w:val="24"/>
           <w:szCs w:val="24"/>
         </w:rPr>
-        <w:t xml:space="preserve">| is the areas of the grown region and of the brain, in pixels, </w:t>
+        <w:t xml:space="preserve">| are the areas of the grown region and of the brain, in pixels, </w:t>
       </w:r>
       <w:r>
         <w:rPr>
@@ -16877,7 +16877,7 @@
           <w:sz w:val="24"/>
           <w:szCs w:val="24"/>
         </w:rPr>
-        <w:t xml:space="preserve"> is the retry number and the maximum number of retries, 3.</w:t>
+        <w:t xml:space="preserve"> are the retry number and the maximum number of retries, 3.</w:t>
       </w:r>
     </w:p>
     <w:p>

</xml_diff>